<commit_message>
modifico cronograma de fechas de sprints
</commit_message>
<xml_diff>
--- a/Sprint 0.docx
+++ b/Sprint 0.docx
@@ -514,7 +514,7 @@
                     <w:noProof/>
                     <w:lang w:bidi="es-ES"/>
                   </w:rPr>
-                  <w:t>24 abril</w:t>
+                  <w:t>29 abril</w:t>
                 </w:r>
                 <w:r>
                   <w:rPr>
@@ -4791,41 +4791,9 @@
             <w:tcW w:w="3957" w:type="dxa"/>
           </w:tcPr>
           <w:p>
-            <w:pPr>
-              <w:rPr>
-                <w:bCs w:val="0"/>
-              </w:rPr>
-            </w:pPr>
             <w:bookmarkStart w:id="1" w:name="_Hlk227971386"/>
             <w:r>
-              <w:rPr>
-                <w:bCs w:val="0"/>
-              </w:rPr>
-              <w:t>2</w:t>
-            </w:r>
-            <w:r>
-              <w:rPr>
-                <w:bCs w:val="0"/>
-              </w:rPr>
-              <w:t>5</w:t>
-            </w:r>
-            <w:r>
-              <w:rPr>
-                <w:bCs w:val="0"/>
-              </w:rPr>
-              <w:t>/04/2026-2</w:t>
-            </w:r>
-            <w:r>
-              <w:rPr>
-                <w:bCs w:val="0"/>
-              </w:rPr>
-              <w:t>8</w:t>
-            </w:r>
-            <w:r>
-              <w:rPr>
-                <w:bCs w:val="0"/>
-              </w:rPr>
-              <w:t>/04/2026</w:t>
+              <w:t>25/04/2026-29/04/2026</w:t>
             </w:r>
           </w:p>
         </w:tc>
@@ -4838,49 +4806,15 @@
               <w:cnfStyle w:val="000000100000" w:firstRow="0" w:lastRow="0" w:firstColumn="0" w:lastColumn="0" w:oddVBand="0" w:evenVBand="0" w:oddHBand="1" w:evenHBand="0" w:firstRowFirstColumn="0" w:firstRowLastColumn="0" w:lastRowFirstColumn="0" w:lastRowLastColumn="0"/>
               <w:rPr>
                 <w:b w:val="0"/>
+                <w:bCs/>
               </w:rPr>
             </w:pPr>
             <w:r>
               <w:rPr>
                 <w:b w:val="0"/>
+                <w:bCs/>
               </w:rPr>
-              <w:t>2</w:t>
-            </w:r>
-            <w:r>
-              <w:rPr>
-                <w:b w:val="0"/>
-              </w:rPr>
-              <w:t>9</w:t>
-            </w:r>
-            <w:r>
-              <w:rPr>
-                <w:b w:val="0"/>
-              </w:rPr>
-              <w:t>/04/2026-</w:t>
-            </w:r>
-            <w:r>
-              <w:rPr>
-                <w:b w:val="0"/>
-              </w:rPr>
-              <w:t>02</w:t>
-            </w:r>
-            <w:r>
-              <w:rPr>
-                <w:b w:val="0"/>
-              </w:rPr>
-              <w:t>/0</w:t>
-            </w:r>
-            <w:r>
-              <w:rPr>
-                <w:b w:val="0"/>
-              </w:rPr>
-              <w:t>5</w:t>
-            </w:r>
-            <w:r>
-              <w:rPr>
-                <w:b w:val="0"/>
-              </w:rPr>
-              <w:t>/2026</w:t>
+              <w:t>30/04/2026-05/05/2026</w:t>
             </w:r>
           </w:p>
         </w:tc>
@@ -4893,43 +4827,15 @@
               <w:cnfStyle w:val="000000100000" w:firstRow="0" w:lastRow="0" w:firstColumn="0" w:lastColumn="0" w:oddVBand="0" w:evenVBand="0" w:oddHBand="1" w:evenHBand="0" w:firstRowFirstColumn="0" w:firstRowLastColumn="0" w:lastRowFirstColumn="0" w:lastRowLastColumn="0"/>
               <w:rPr>
                 <w:b w:val="0"/>
+                <w:bCs/>
               </w:rPr>
             </w:pPr>
             <w:r>
               <w:rPr>
                 <w:b w:val="0"/>
+                <w:bCs/>
               </w:rPr>
-              <w:t>06</w:t>
-            </w:r>
-            <w:r>
-              <w:rPr>
-                <w:b w:val="0"/>
-              </w:rPr>
-              <w:t>/0</w:t>
-            </w:r>
-            <w:r>
-              <w:rPr>
-                <w:b w:val="0"/>
-              </w:rPr>
-              <w:t>5</w:t>
-            </w:r>
-            <w:r>
-              <w:rPr>
-                <w:b w:val="0"/>
-              </w:rPr>
-              <w:t>/2026-</w:t>
-            </w:r>
-            <w:r>
-              <w:rPr>
-                <w:b w:val="0"/>
-              </w:rPr>
-              <w:t>07</w:t>
-            </w:r>
-            <w:r>
-              <w:rPr>
-                <w:b w:val="0"/>
-              </w:rPr>
-              <w:t>/04/2026</w:t>
+              <w:t>06/05/2026-08/04/2026</w:t>
             </w:r>
           </w:p>
         </w:tc>
@@ -11740,10 +11646,12 @@
     <w:rsid w:val="000D4FAD"/>
     <w:rsid w:val="002E47CA"/>
     <w:rsid w:val="00476239"/>
+    <w:rsid w:val="0056075F"/>
     <w:rsid w:val="0067171A"/>
     <w:rsid w:val="007F2F63"/>
     <w:rsid w:val="009B0278"/>
     <w:rsid w:val="00A62ED6"/>
+    <w:rsid w:val="00AA71D4"/>
     <w:rsid w:val="00BF56C3"/>
     <w:rsid w:val="00F27593"/>
     <w:rsid w:val="00F93A10"/>

</xml_diff>